<commit_message>
Adding Bones resource symbol.
</commit_message>
<xml_diff>
--- a/AO_early-alpha/card-files/AO_early-alpha_test-cards/tOA_early-alpha_print-table_002.docx
+++ b/AO_early-alpha/card-files/AO_early-alpha_test-cards/tOA_early-alpha_print-table_002.docx
@@ -38,7 +38,7 @@
                 <w:noProof/>
               </w:rPr>
               <w:drawing>
-                <wp:inline distT="0" distB="0" distL="0" distR="0" wp14:anchorId="49AD5519" wp14:editId="6E65D0CC">
+                <wp:inline distT="0" distB="0" distL="0" distR="0" wp14:anchorId="49AD5519" wp14:editId="2B447AB1">
                   <wp:extent cx="2222500" cy="3092450"/>
                   <wp:effectExtent l="0" t="0" r="6350" b="0"/>
                   <wp:docPr id="1865047481" name="Picture 1"/>
@@ -98,7 +98,7 @@
                 <w:noProof/>
               </w:rPr>
               <w:drawing>
-                <wp:inline distT="0" distB="0" distL="0" distR="0" wp14:anchorId="767FE891" wp14:editId="3D367CFD">
+                <wp:inline distT="0" distB="0" distL="0" distR="0" wp14:anchorId="767FE891" wp14:editId="1A257D4C">
                   <wp:extent cx="2222500" cy="3092450"/>
                   <wp:effectExtent l="0" t="0" r="6350" b="0"/>
                   <wp:docPr id="780496951" name="Picture 2"/>
@@ -1596,7 +1596,7 @@
                 <w:noProof/>
               </w:rPr>
               <w:drawing>
-                <wp:inline distT="0" distB="0" distL="0" distR="0" wp14:anchorId="7C15BE25" wp14:editId="41D49D47">
+                <wp:inline distT="0" distB="0" distL="0" distR="0" wp14:anchorId="7C15BE25" wp14:editId="7B5F82AF">
                   <wp:extent cx="2219325" cy="3095625"/>
                   <wp:effectExtent l="0" t="0" r="9525" b="9525"/>
                   <wp:docPr id="505656691" name="Picture 29"/>
@@ -1778,7 +1778,7 @@
       </w:pPr>
     </w:p>
     <w:sectPr>
-      <w:pgSz w:w="11906" w:h="16838"/>
+      <w:pgSz w:w="11906" w:h="16838" w:code="9"/>
       <w:pgMar w:top="567" w:right="567" w:bottom="284" w:left="567" w:header="709" w:footer="709" w:gutter="0"/>
       <w:cols w:space="708"/>
       <w:docGrid w:linePitch="360"/>

</xml_diff>